<commit_message>
Refresh report with convergence evidence
</commit_message>
<xml_diff>
--- a/report/report.docx
+++ b/report/report.docx
@@ -171,7 +171,61 @@
         <w:pStyle w:val="Heading1"/>
       </w:pPr>
       <w:r>
-        <w:t>4. Рендери діаграм</w:t>
+        <w:t>4. Запити до ШІ та convergence</w:t>
+      </w:r>
+    </w:p>
+    <w:p>
+      <w:r>
+        <w:t>Застосовано послідовність запитів: /speckit-constitution, /speckit-specify, /speckit-plan, /speckit-tasks, /speckit-implement, /speckit-converge. Фінальний знімок репозиторію після convergence-проходу додано як report/converge-repo.png.</w:t>
+      </w:r>
+    </w:p>
+    <w:p>
+      <w:r>
+        <w:t>Публічний репозиторій: https://github.com/tetoraillia/translationservice. CRC sheet: https://github.com/tetoraillia/translationservice/blob/main/docs/crc.xlsx</w:t>
+      </w:r>
+    </w:p>
+    <w:p>
+      <w:r>
+        <w:drawing>
+          <wp:inline xmlns:a="http://schemas.openxmlformats.org/drawingml/2006/main" xmlns:pic="http://schemas.openxmlformats.org/drawingml/2006/picture">
+            <wp:extent cx="5669280" cy="13844396"/>
+            <wp:docPr id="1" name="Picture 1"/>
+            <wp:cNvGraphicFramePr>
+              <a:graphicFrameLocks noChangeAspect="1"/>
+            </wp:cNvGraphicFramePr>
+            <a:graphic>
+              <a:graphicData uri="http://schemas.openxmlformats.org/drawingml/2006/picture">
+                <pic:pic>
+                  <pic:nvPicPr>
+                    <pic:cNvPr id="0" name="converge-repo.png"/>
+                    <pic:cNvPicPr/>
+                  </pic:nvPicPr>
+                  <pic:blipFill>
+                    <a:blip r:embed="rId9"/>
+                    <a:stretch>
+                      <a:fillRect/>
+                    </a:stretch>
+                  </pic:blipFill>
+                  <pic:spPr>
+                    <a:xfrm>
+                      <a:off x="0" y="0"/>
+                      <a:ext cx="5669280" cy="13844396"/>
+                    </a:xfrm>
+                    <a:prstGeom prst="rect"/>
+                  </pic:spPr>
+                </pic:pic>
+              </a:graphicData>
+            </a:graphic>
+          </wp:inline>
+        </w:drawing>
+      </w:r>
+    </w:p>
+    <w:p>
+      <w:pPr>
+        <w:pStyle w:val="Heading1"/>
+      </w:pPr>
+      <w:r>
+        <w:t>5. Рендери діаграм</w:t>
       </w:r>
     </w:p>
     <w:p>
@@ -184,7 +238,7 @@
         <w:drawing>
           <wp:inline xmlns:a="http://schemas.openxmlformats.org/drawingml/2006/main" xmlns:pic="http://schemas.openxmlformats.org/drawingml/2006/picture">
             <wp:extent cx="5669280" cy="5519177"/>
-            <wp:docPr id="1" name="Picture 1"/>
+            <wp:docPr id="2" name="Picture 2"/>
             <wp:cNvGraphicFramePr>
               <a:graphicFrameLocks noChangeAspect="1"/>
             </wp:cNvGraphicFramePr>
@@ -196,7 +250,7 @@
                     <pic:cNvPicPr/>
                   </pic:nvPicPr>
                   <pic:blipFill>
-                    <a:blip r:embed="rId9"/>
+                    <a:blip r:embed="rId10"/>
                     <a:stretch>
                       <a:fillRect/>
                     </a:stretch>
@@ -225,7 +279,7 @@
         <w:drawing>
           <wp:inline xmlns:a="http://schemas.openxmlformats.org/drawingml/2006/main" xmlns:pic="http://schemas.openxmlformats.org/drawingml/2006/picture">
             <wp:extent cx="5669280" cy="2521996"/>
-            <wp:docPr id="2" name="Picture 2"/>
+            <wp:docPr id="3" name="Picture 3"/>
             <wp:cNvGraphicFramePr>
               <a:graphicFrameLocks noChangeAspect="1"/>
             </wp:cNvGraphicFramePr>
@@ -237,7 +291,7 @@
                     <pic:cNvPicPr/>
                   </pic:nvPicPr>
                   <pic:blipFill>
-                    <a:blip r:embed="rId10"/>
+                    <a:blip r:embed="rId11"/>
                     <a:stretch>
                       <a:fillRect/>
                     </a:stretch>
@@ -265,8 +319,8 @@
       <w:r>
         <w:drawing>
           <wp:inline xmlns:a="http://schemas.openxmlformats.org/drawingml/2006/main" xmlns:pic="http://schemas.openxmlformats.org/drawingml/2006/picture">
-            <wp:extent cx="5669280" cy="4024095"/>
-            <wp:docPr id="3" name="Picture 3"/>
+            <wp:extent cx="5669280" cy="4157472"/>
+            <wp:docPr id="4" name="Picture 4"/>
             <wp:cNvGraphicFramePr>
               <a:graphicFrameLocks noChangeAspect="1"/>
             </wp:cNvGraphicFramePr>
@@ -278,7 +332,7 @@
                     <pic:cNvPicPr/>
                   </pic:nvPicPr>
                   <pic:blipFill>
-                    <a:blip r:embed="rId11"/>
+                    <a:blip r:embed="rId12"/>
                     <a:stretch>
                       <a:fillRect/>
                     </a:stretch>
@@ -286,7 +340,7 @@
                   <pic:spPr>
                     <a:xfrm>
                       <a:off x="0" y="0"/>
-                      <a:ext cx="5669280" cy="4024095"/>
+                      <a:ext cx="5669280" cy="4157472"/>
                     </a:xfrm>
                     <a:prstGeom prst="rect"/>
                   </pic:spPr>
@@ -307,7 +361,7 @@
         <w:drawing>
           <wp:inline xmlns:a="http://schemas.openxmlformats.org/drawingml/2006/main" xmlns:pic="http://schemas.openxmlformats.org/drawingml/2006/picture">
             <wp:extent cx="5669280" cy="11713831"/>
-            <wp:docPr id="4" name="Picture 4"/>
+            <wp:docPr id="5" name="Picture 5"/>
             <wp:cNvGraphicFramePr>
               <a:graphicFrameLocks noChangeAspect="1"/>
             </wp:cNvGraphicFramePr>
@@ -319,7 +373,7 @@
                     <pic:cNvPicPr/>
                   </pic:nvPicPr>
                   <pic:blipFill>
-                    <a:blip r:embed="rId12"/>
+                    <a:blip r:embed="rId13"/>
                     <a:stretch>
                       <a:fillRect/>
                     </a:stretch>
@@ -339,11 +393,16 @@
       </w:r>
     </w:p>
     <w:p>
+      <w:r>
+        <w:t>У class-діаграмі displayRole() має сигнатуру displayRole() final void; performTask() перевизначається, addSegment() перевантажений.</w:t>
+      </w:r>
+    </w:p>
+    <w:p>
       <w:pPr>
         <w:pStyle w:val="Heading1"/>
       </w:pPr>
       <w:r>
-        <w:t>5. Висновок</w:t>
+        <w:t>6. Висновок</w:t>
       </w:r>
     </w:p>
     <w:p>

</xml_diff>

<commit_message>
Align sequence with project state lifecycle
</commit_message>
<xml_diff>
--- a/report/report.docx
+++ b/report/report.docx
@@ -319,7 +319,7 @@
       <w:r>
         <w:drawing>
           <wp:inline xmlns:a="http://schemas.openxmlformats.org/drawingml/2006/main" xmlns:pic="http://schemas.openxmlformats.org/drawingml/2006/picture">
-            <wp:extent cx="5669280" cy="4157472"/>
+            <wp:extent cx="5669280" cy="4503549"/>
             <wp:docPr id="4" name="Picture 4"/>
             <wp:cNvGraphicFramePr>
               <a:graphicFrameLocks noChangeAspect="1"/>
@@ -340,7 +340,7 @@
                   <pic:spPr>
                     <a:xfrm>
                       <a:off x="0" y="0"/>
-                      <a:ext cx="5669280" cy="4157472"/>
+                      <a:ext cx="5669280" cy="4503549"/>
                     </a:xfrm>
                     <a:prstGeom prst="rect"/>
                   </pic:spPr>

</xml_diff>

<commit_message>
Refresh report after model alignment
</commit_message>
<xml_diff>
--- a/report/report.docx
+++ b/report/report.docx
@@ -278,7 +278,7 @@
       <w:r>
         <w:drawing>
           <wp:inline xmlns:a="http://schemas.openxmlformats.org/drawingml/2006/main" xmlns:pic="http://schemas.openxmlformats.org/drawingml/2006/picture">
-            <wp:extent cx="5669280" cy="2521996"/>
+            <wp:extent cx="5669280" cy="2569637"/>
             <wp:docPr id="3" name="Picture 3"/>
             <wp:cNvGraphicFramePr>
               <a:graphicFrameLocks noChangeAspect="1"/>
@@ -299,7 +299,7 @@
                   <pic:spPr>
                     <a:xfrm>
                       <a:off x="0" y="0"/>
-                      <a:ext cx="5669280" cy="2521996"/>
+                      <a:ext cx="5669280" cy="2569637"/>
                     </a:xfrm>
                     <a:prstGeom prst="rect"/>
                   </pic:spPr>

</xml_diff>

<commit_message>
Document convergence snapshot provenance
</commit_message>
<xml_diff>
--- a/report/report.docx
+++ b/report/report.docx
@@ -176,7 +176,7 @@
     </w:p>
     <w:p>
       <w:r>
-        <w:t>Застосовано послідовність запитів: /speckit-constitution, /speckit-specify, /speckit-plan, /speckit-tasks, /speckit-implement, /speckit-converge. Фінальний знімок репозиторію після convergence-проходу додано як report/converge-repo.png.</w:t>
+        <w:t>Застосовано послідовність запитів: /speckit-constitution, /speckit-specify, /speckit-plan, /speckit-tasks, /speckit-implement, /speckit-converge. Знімок стану репозиторію на commit f29d994 зроблено до додавання самого evidence-файлу; він доданий як report/converge-repo.png.</w:t>
       </w:r>
     </w:p>
     <w:p>
@@ -360,7 +360,7 @@
       <w:r>
         <w:drawing>
           <wp:inline xmlns:a="http://schemas.openxmlformats.org/drawingml/2006/main" xmlns:pic="http://schemas.openxmlformats.org/drawingml/2006/picture">
-            <wp:extent cx="5669280" cy="11713831"/>
+            <wp:extent cx="2148840" cy="4439920"/>
             <wp:docPr id="5" name="Picture 5"/>
             <wp:cNvGraphicFramePr>
               <a:graphicFrameLocks noChangeAspect="1"/>
@@ -381,7 +381,7 @@
                   <pic:spPr>
                     <a:xfrm>
                       <a:off x="0" y="0"/>
-                      <a:ext cx="5669280" cy="11713831"/>
+                      <a:ext cx="2148840" cy="4439920"/>
                     </a:xfrm>
                     <a:prstGeom prst="rect"/>
                   </pic:spPr>

</xml_diff>